<commit_message>
Sprint 12: Limpieza final antes del despliegue (Fix extensiones y docx)
</commit_message>
<xml_diff>
--- a/Whitepaper/Plan de Desarrollo.docx
+++ b/Whitepaper/Plan de Desarrollo.docx
@@ -4,6 +4,112 @@
   <w:body>
     <w:p>
       <w:pPr>
+        <w:rPr>
+          <w:b/>
+          <w:bCs/>
+          <w:lang w:val="es-MX"/>
+        </w:rPr>
+      </w:pPr>
+      <w:r>
+        <w:rPr>
+          <w:b/>
+          <w:bCs/>
+          <w:lang w:val="es-MX"/>
+        </w:rPr>
+        <w:br w:type="page"/>
+      </w:r>
+      <w:r>
+        <w:rPr>
+          <w:b/>
+          <w:bCs/>
+          <w:lang w:val="es-MX"/>
+        </w:rPr>
+        <w:lastRenderedPageBreak/>
+        <w:t>Detalles CDCV</w:t>
+      </w:r>
+    </w:p>
+    <w:p>
+      <w:pPr>
+        <w:pStyle w:val="Prrafodelista"/>
+        <w:numPr>
+          <w:ilvl w:val="0"/>
+          <w:numId w:val="4"/>
+        </w:numPr>
+        <w:rPr>
+          <w:b/>
+          <w:bCs/>
+          <w:lang w:val="es-MX"/>
+        </w:rPr>
+      </w:pPr>
+      <w:r>
+        <w:rPr>
+          <w:b/>
+          <w:bCs/>
+          <w:lang w:val="es-MX"/>
+        </w:rPr>
+        <w:t>4 alternativas por pregunta.</w:t>
+      </w:r>
+    </w:p>
+    <w:p>
+      <w:pPr>
+        <w:pStyle w:val="Prrafodelista"/>
+        <w:numPr>
+          <w:ilvl w:val="0"/>
+          <w:numId w:val="4"/>
+        </w:numPr>
+        <w:rPr>
+          <w:b/>
+          <w:bCs/>
+          <w:lang w:val="es-MX"/>
+        </w:rPr>
+      </w:pPr>
+      <w:r>
+        <w:rPr>
+          <w:b/>
+          <w:bCs/>
+          <w:lang w:val="es-MX"/>
+        </w:rPr>
+        <w:t>1 respuesta correcta y 3 respuestas incorrectas por pregunta.</w:t>
+      </w:r>
+    </w:p>
+    <w:p>
+      <w:pPr>
+        <w:rPr>
+          <w:b/>
+          <w:bCs/>
+          <w:lang w:val="es-MX"/>
+        </w:rPr>
+      </w:pPr>
+    </w:p>
+    <w:p>
+      <w:pPr>
+        <w:rPr>
+          <w:b/>
+          <w:bCs/>
+          <w:lang w:val="es-MX"/>
+        </w:rPr>
+      </w:pPr>
+    </w:p>
+    <w:p>
+      <w:pPr>
+        <w:rPr>
+          <w:b/>
+          <w:bCs/>
+          <w:lang w:val="es-MX"/>
+        </w:rPr>
+      </w:pPr>
+    </w:p>
+    <w:p>
+      <w:pPr>
+        <w:rPr>
+          <w:b/>
+          <w:bCs/>
+          <w:lang w:val="es-MX"/>
+        </w:rPr>
+      </w:pPr>
+    </w:p>
+    <w:p>
+      <w:pPr>
         <w:jc w:val="center"/>
         <w:rPr>
           <w:b/>
@@ -59,7 +165,23 @@
           <w:bCs/>
           <w:lang w:val="es-MX"/>
         </w:rPr>
-        <w:t>Día 1: Desarrollo de MVP:</w:t>
+        <w:t>Día 1</w:t>
+      </w:r>
+      <w:r>
+        <w:rPr>
+          <w:b/>
+          <w:bCs/>
+          <w:lang w:val="es-MX"/>
+        </w:rPr>
+        <w:t xml:space="preserve"> – 08-11-2025</w:t>
+      </w:r>
+      <w:r>
+        <w:rPr>
+          <w:b/>
+          <w:bCs/>
+          <w:lang w:val="es-MX"/>
+        </w:rPr>
+        <w:t xml:space="preserve"> Desarrollo de MVP:</w:t>
       </w:r>
     </w:p>
     <w:p>
@@ -151,7 +273,52 @@
           <w:b/>
           <w:bCs/>
         </w:rPr>
-        <w:t xml:space="preserve">Día 2: </w:t>
+        <w:t>Día 2</w:t>
+      </w:r>
+      <w:r>
+        <w:rPr>
+          <w:b/>
+          <w:bCs/>
+        </w:rPr>
+        <w:t xml:space="preserve"> </w:t>
+      </w:r>
+      <w:r>
+        <w:rPr>
+          <w:b/>
+          <w:bCs/>
+          <w:lang w:val="es-MX"/>
+        </w:rPr>
+        <w:t>– 0</w:t>
+      </w:r>
+      <w:r>
+        <w:rPr>
+          <w:b/>
+          <w:bCs/>
+          <w:lang w:val="es-MX"/>
+        </w:rPr>
+        <w:t>9</w:t>
+      </w:r>
+      <w:r>
+        <w:rPr>
+          <w:b/>
+          <w:bCs/>
+          <w:lang w:val="es-MX"/>
+        </w:rPr>
+        <w:t>-11-2025</w:t>
+      </w:r>
+      <w:r>
+        <w:rPr>
+          <w:b/>
+          <w:bCs/>
+        </w:rPr>
+        <w:t xml:space="preserve">: </w:t>
+      </w:r>
+      <w:r>
+        <w:rPr>
+          <w:b/>
+          <w:bCs/>
+        </w:rPr>
+        <w:t>Reestructuración modelo de datos.</w:t>
       </w:r>
     </w:p>
     <w:p>
@@ -171,47 +338,46 @@
           <w:b/>
           <w:bCs/>
         </w:rPr>
-        <w:t xml:space="preserve">Creación de un </w:t>
-      </w:r>
-      <w:proofErr w:type="gramStart"/>
-      <w:r>
-        <w:rPr>
-          <w:b/>
-          <w:bCs/>
-        </w:rPr>
-        <w:t>archivo .</w:t>
+        <w:t>Seguridad</w:t>
+      </w:r>
+      <w:r>
+        <w:rPr>
+          <w:b/>
+          <w:bCs/>
+        </w:rPr>
+        <w:t xml:space="preserve"> y trazabilidad</w:t>
+      </w:r>
+      <w:r>
+        <w:rPr>
+          <w:b/>
+          <w:bCs/>
+        </w:rPr>
+        <w:t>:</w:t>
+      </w:r>
+      <w:r>
+        <w:rPr>
+          <w:b/>
+          <w:bCs/>
+        </w:rPr>
+        <w:t xml:space="preserve"> </w:t>
+      </w:r>
+      <w:r>
+        <w:t>Creación de un archivo .</w:t>
       </w:r>
       <w:proofErr w:type="spellStart"/>
       <w:r>
-        <w:rPr>
-          <w:b/>
-          <w:bCs/>
-        </w:rPr>
         <w:t>env</w:t>
       </w:r>
       <w:proofErr w:type="spellEnd"/>
-      <w:proofErr w:type="gramEnd"/>
-      <w:r>
-        <w:rPr>
-          <w:b/>
-          <w:bCs/>
-        </w:rPr>
+      <w:r>
         <w:t xml:space="preserve"> para seguridad de contraseñas, subido a </w:t>
       </w:r>
       <w:proofErr w:type="spellStart"/>
       <w:r>
-        <w:rPr>
-          <w:b/>
-          <w:bCs/>
-        </w:rPr>
         <w:t>Github</w:t>
       </w:r>
       <w:proofErr w:type="spellEnd"/>
       <w:r>
-        <w:rPr>
-          <w:b/>
-          <w:bCs/>
-        </w:rPr>
         <w:t>.</w:t>
       </w:r>
     </w:p>
@@ -232,25 +398,415 @@
           <w:b/>
           <w:bCs/>
         </w:rPr>
+        <w:t xml:space="preserve">Monetización: </w:t>
+      </w:r>
+      <w:r>
         <w:t xml:space="preserve">Aprobación del flujo </w:t>
       </w:r>
       <w:proofErr w:type="spellStart"/>
       <w:r>
-        <w:rPr>
-          <w:b/>
-          <w:bCs/>
-        </w:rPr>
         <w:t>Paypal</w:t>
       </w:r>
       <w:proofErr w:type="spellEnd"/>
       <w:r>
-        <w:rPr>
-          <w:b/>
-          <w:bCs/>
-        </w:rPr>
         <w:t>.</w:t>
       </w:r>
     </w:p>
+    <w:p>
+      <w:pPr>
+        <w:pStyle w:val="Prrafodelista"/>
+        <w:numPr>
+          <w:ilvl w:val="0"/>
+          <w:numId w:val="3"/>
+        </w:numPr>
+      </w:pPr>
+      <w:r>
+        <w:rPr>
+          <w:b/>
+          <w:bCs/>
+        </w:rPr>
+        <w:t>Cantidad de Preguntas:</w:t>
+      </w:r>
+      <w:r>
+        <w:t xml:space="preserve"> </w:t>
+      </w:r>
+      <w:r>
+        <w:t xml:space="preserve">Aumenté el </w:t>
+      </w:r>
+      <w:proofErr w:type="spellStart"/>
+      <w:r>
+        <w:t>stack</w:t>
+      </w:r>
+      <w:proofErr w:type="spellEnd"/>
+      <w:r>
+        <w:t xml:space="preserve"> de preguntas de 50 a 100. </w:t>
+      </w:r>
+    </w:p>
+    <w:p>
+      <w:pPr>
+        <w:pStyle w:val="Prrafodelista"/>
+        <w:numPr>
+          <w:ilvl w:val="0"/>
+          <w:numId w:val="3"/>
+        </w:numPr>
+      </w:pPr>
+      <w:r>
+        <w:rPr>
+          <w:b/>
+          <w:bCs/>
+        </w:rPr>
+        <w:t>Estructura BB.</w:t>
+      </w:r>
+      <w:r>
+        <w:t>DD: Cambios, las preguntas ya no dependerán de un curso sino se asocian a un tema, y los temas se relacionan con los cursos, creando un modelo más robust</w:t>
+      </w:r>
+      <w:r>
+        <w:t>o.</w:t>
+      </w:r>
+      <w:r>
+        <w:t xml:space="preserve"> </w:t>
+      </w:r>
+      <w:r>
+        <w:t xml:space="preserve">Base de Datos: </w:t>
+      </w:r>
+      <w:r>
+        <w:t xml:space="preserve">incorpora </w:t>
+      </w:r>
+      <w:r>
+        <w:t>Taxonomía, Dificultad, Modelo Intermediario</w:t>
+      </w:r>
+    </w:p>
+    <w:p/>
+    <w:p>
+      <w:pPr>
+        <w:rPr>
+          <w:b/>
+          <w:bCs/>
+        </w:rPr>
+      </w:pPr>
+      <w:r>
+        <w:rPr>
+          <w:b/>
+          <w:bCs/>
+        </w:rPr>
+        <w:t xml:space="preserve">Día </w:t>
+      </w:r>
+      <w:r>
+        <w:rPr>
+          <w:b/>
+          <w:bCs/>
+        </w:rPr>
+        <w:t>3</w:t>
+      </w:r>
+      <w:r>
+        <w:rPr>
+          <w:b/>
+          <w:bCs/>
+        </w:rPr>
+        <w:t xml:space="preserve"> </w:t>
+      </w:r>
+      <w:r>
+        <w:rPr>
+          <w:b/>
+          <w:bCs/>
+          <w:lang w:val="es-MX"/>
+        </w:rPr>
+        <w:t xml:space="preserve">– </w:t>
+      </w:r>
+      <w:r>
+        <w:rPr>
+          <w:b/>
+          <w:bCs/>
+          <w:lang w:val="es-MX"/>
+        </w:rPr>
+        <w:t>10</w:t>
+      </w:r>
+      <w:r>
+        <w:rPr>
+          <w:b/>
+          <w:bCs/>
+          <w:lang w:val="es-MX"/>
+        </w:rPr>
+        <w:t>-11-2025</w:t>
+      </w:r>
+      <w:r>
+        <w:rPr>
+          <w:b/>
+          <w:bCs/>
+        </w:rPr>
+        <w:t xml:space="preserve">: </w:t>
+      </w:r>
+      <w:r>
+        <w:rPr>
+          <w:b/>
+          <w:bCs/>
+        </w:rPr>
+        <w:t>Sin Actividad</w:t>
+      </w:r>
+    </w:p>
+    <w:p>
+      <w:pPr>
+        <w:rPr>
+          <w:b/>
+          <w:bCs/>
+        </w:rPr>
+      </w:pPr>
+      <w:r>
+        <w:rPr>
+          <w:b/>
+          <w:bCs/>
+        </w:rPr>
+        <w:t>Día 4 – 11-11-2025</w:t>
+      </w:r>
+    </w:p>
+    <w:p>
+      <w:pPr>
+        <w:pStyle w:val="Prrafodelista"/>
+        <w:numPr>
+          <w:ilvl w:val="0"/>
+          <w:numId w:val="5"/>
+        </w:numPr>
+        <w:rPr>
+          <w:b/>
+          <w:bCs/>
+        </w:rPr>
+      </w:pPr>
+      <w:r>
+        <w:rPr>
+          <w:b/>
+          <w:bCs/>
+        </w:rPr>
+        <w:t>Marketing: Creación de Cuentas redes Sociales</w:t>
+      </w:r>
+      <w:r>
+        <w:rPr>
+          <w:b/>
+          <w:bCs/>
+        </w:rPr>
+        <w:t>:</w:t>
+      </w:r>
+    </w:p>
+    <w:p>
+      <w:pPr>
+        <w:pStyle w:val="Prrafodelista"/>
+        <w:numPr>
+          <w:ilvl w:val="1"/>
+          <w:numId w:val="5"/>
+        </w:numPr>
+        <w:rPr>
+          <w:b/>
+          <w:bCs/>
+        </w:rPr>
+      </w:pPr>
+      <w:r>
+        <w:rPr>
+          <w:b/>
+          <w:bCs/>
+        </w:rPr>
+        <w:t>Correo electrónico</w:t>
+      </w:r>
+    </w:p>
+    <w:p>
+      <w:pPr>
+        <w:pStyle w:val="Prrafodelista"/>
+        <w:numPr>
+          <w:ilvl w:val="1"/>
+          <w:numId w:val="5"/>
+        </w:numPr>
+        <w:rPr>
+          <w:b/>
+          <w:bCs/>
+        </w:rPr>
+      </w:pPr>
+      <w:r>
+        <w:rPr>
+          <w:b/>
+          <w:bCs/>
+        </w:rPr>
+        <w:t>Cuenta X</w:t>
+      </w:r>
+    </w:p>
+    <w:p>
+      <w:pPr>
+        <w:pStyle w:val="Prrafodelista"/>
+        <w:numPr>
+          <w:ilvl w:val="1"/>
+          <w:numId w:val="5"/>
+        </w:numPr>
+        <w:rPr>
+          <w:b/>
+          <w:bCs/>
+        </w:rPr>
+      </w:pPr>
+      <w:r>
+        <w:rPr>
+          <w:b/>
+          <w:bCs/>
+        </w:rPr>
+        <w:t xml:space="preserve">Edición Facebook Empresa de </w:t>
+      </w:r>
+      <w:proofErr w:type="spellStart"/>
+      <w:r>
+        <w:rPr>
+          <w:b/>
+          <w:bCs/>
+        </w:rPr>
+        <w:t>EmprendeBOT</w:t>
+      </w:r>
+      <w:proofErr w:type="spellEnd"/>
+      <w:r>
+        <w:rPr>
+          <w:b/>
+          <w:bCs/>
+        </w:rPr>
+        <w:t xml:space="preserve"> a CDCV </w:t>
+      </w:r>
+      <w:proofErr w:type="spellStart"/>
+      <w:r>
+        <w:rPr>
+          <w:b/>
+          <w:bCs/>
+        </w:rPr>
+        <w:t>Certs</w:t>
+      </w:r>
+      <w:proofErr w:type="spellEnd"/>
+    </w:p>
+    <w:p>
+      <w:pPr>
+        <w:pStyle w:val="Prrafodelista"/>
+        <w:numPr>
+          <w:ilvl w:val="1"/>
+          <w:numId w:val="5"/>
+        </w:numPr>
+        <w:rPr>
+          <w:b/>
+          <w:bCs/>
+        </w:rPr>
+      </w:pPr>
+      <w:r>
+        <w:rPr>
+          <w:b/>
+          <w:bCs/>
+        </w:rPr>
+        <w:t xml:space="preserve">Edición Instagram de </w:t>
+      </w:r>
+      <w:proofErr w:type="spellStart"/>
+      <w:r>
+        <w:rPr>
+          <w:b/>
+          <w:bCs/>
+        </w:rPr>
+        <w:t>EmprendeBOT</w:t>
+      </w:r>
+      <w:proofErr w:type="spellEnd"/>
+      <w:r>
+        <w:rPr>
+          <w:b/>
+          <w:bCs/>
+        </w:rPr>
+        <w:t xml:space="preserve"> a CDCV </w:t>
+      </w:r>
+      <w:proofErr w:type="spellStart"/>
+      <w:r>
+        <w:rPr>
+          <w:b/>
+          <w:bCs/>
+        </w:rPr>
+        <w:t>Certs</w:t>
+      </w:r>
+      <w:proofErr w:type="spellEnd"/>
+    </w:p>
+    <w:p>
+      <w:pPr>
+        <w:rPr>
+          <w:b/>
+          <w:bCs/>
+        </w:rPr>
+      </w:pPr>
+    </w:p>
+    <w:p>
+      <w:pPr>
+        <w:rPr>
+          <w:b/>
+          <w:bCs/>
+        </w:rPr>
+      </w:pPr>
+      <w:r>
+        <w:rPr>
+          <w:b/>
+          <w:bCs/>
+        </w:rPr>
+        <w:lastRenderedPageBreak/>
+        <w:t>Día 5 – 12-11-2025</w:t>
+      </w:r>
+    </w:p>
+    <w:p>
+      <w:pPr>
+        <w:pStyle w:val="Prrafodelista"/>
+        <w:numPr>
+          <w:ilvl w:val="0"/>
+          <w:numId w:val="5"/>
+        </w:numPr>
+      </w:pPr>
+      <w:r>
+        <w:rPr>
+          <w:b/>
+          <w:bCs/>
+        </w:rPr>
+        <w:t xml:space="preserve">Contenido: </w:t>
+      </w:r>
+      <w:r>
+        <w:t>Creación del curso 3 de Python</w:t>
+      </w:r>
+      <w:r>
+        <w:t xml:space="preserve"> con 10 preguntas. Publicación en el sitio localhost</w:t>
+      </w:r>
+    </w:p>
+    <w:p>
+      <w:pPr>
+        <w:pStyle w:val="Prrafodelista"/>
+        <w:numPr>
+          <w:ilvl w:val="0"/>
+          <w:numId w:val="5"/>
+        </w:numPr>
+      </w:pPr>
+      <w:r>
+        <w:rPr>
+          <w:b/>
+          <w:bCs/>
+        </w:rPr>
+        <w:t>Página Web:</w:t>
+      </w:r>
+      <w:r>
+        <w:t xml:space="preserve"> Planificación de página web, se determina que bajo la premisa de ganar antes de pagar se publicará en </w:t>
+      </w:r>
+      <w:r>
+        <w:t>cdvc-certs.onrender.com</w:t>
+      </w:r>
+      <w:r>
+        <w:t>.</w:t>
+      </w:r>
+    </w:p>
+    <w:p>
+      <w:pPr>
+        <w:pStyle w:val="Prrafodelista"/>
+        <w:numPr>
+          <w:ilvl w:val="0"/>
+          <w:numId w:val="5"/>
+        </w:numPr>
+      </w:pPr>
+    </w:p>
+    <w:p>
+      <w:pPr>
+        <w:rPr>
+          <w:b/>
+          <w:bCs/>
+        </w:rPr>
+      </w:pPr>
+    </w:p>
+    <w:p/>
+    <w:p/>
+    <w:p/>
     <w:p>
       <w:pPr>
         <w:pStyle w:val="Prrafodelista"/>
@@ -286,6 +842,56 @@
 </w:document>
 </file>
 
+<file path=word/endnotes.xml><?xml version="1.0" encoding="utf-8"?>
+<w:endnotes xmlns:wpc="http://schemas.microsoft.com/office/word/2010/wordprocessingCanvas" xmlns:cx="http://schemas.microsoft.com/office/drawing/2014/chartex" xmlns:cx1="http://schemas.microsoft.com/office/drawing/2015/9/8/chartex" xmlns:cx2="http://schemas.microsoft.com/office/drawing/2015/10/21/chartex" xmlns:cx3="http://schemas.microsoft.com/office/drawing/2016/5/9/chartex" xmlns:cx4="http://schemas.microsoft.com/office/drawing/2016/5/10/chartex" xmlns:cx5="http://schemas.microsoft.com/office/drawing/2016/5/11/chartex" xmlns:cx6="http://schemas.microsoft.com/office/drawing/2016/5/12/chartex" xmlns:cx7="http://schemas.microsoft.com/office/drawing/2016/5/13/chartex" xmlns:cx8="http://schemas.microsoft.com/office/drawing/2016/5/14/chartex" xmlns:mc="http://schemas.openxmlformats.org/markup-compatibility/2006" xmlns:aink="http://schemas.microsoft.com/office/drawing/2016/ink" xmlns:am3d="http://schemas.microsoft.com/office/drawing/2017/model3d" xmlns:o="urn:schemas-microsoft-com:office:office" xmlns:oel="http://schemas.microsoft.com/office/2019/extlst" xmlns:r="http://schemas.openxmlformats.org/officeDocument/2006/relationships" xmlns:m="http://schemas.openxmlformats.org/officeDocument/2006/math" xmlns:v="urn:schemas-microsoft-com:vml" xmlns:wp14="http://schemas.microsoft.com/office/word/2010/wordprocessingDrawing" xmlns:wp="http://schemas.openxmlformats.org/drawingml/2006/wordprocessingDrawing" xmlns:w10="urn:schemas-microsoft-com:office:word" xmlns:w="http://schemas.openxmlformats.org/wordprocessingml/2006/main" xmlns:w14="http://schemas.microsoft.com/office/word/2010/wordml" xmlns:w15="http://schemas.microsoft.com/office/word/2012/wordml" xmlns:w16cex="http://schemas.microsoft.com/office/word/2018/wordml/cex" xmlns:w16cid="http://schemas.microsoft.com/office/word/2016/wordml/cid" xmlns:w16="http://schemas.microsoft.com/office/word/2018/wordml" xmlns:w16du="http://schemas.microsoft.com/office/word/2023/wordml/word16du" xmlns:w16sdtdh="http://schemas.microsoft.com/office/word/2020/wordml/sdtdatahash" xmlns:w16sdtfl="http://schemas.microsoft.com/office/word/2024/wordml/sdtformatlock" xmlns:w16se="http://schemas.microsoft.com/office/word/2015/wordml/symex" xmlns:wpg="http://schemas.microsoft.com/office/word/2010/wordprocessingGroup" xmlns:wpi="http://schemas.microsoft.com/office/word/2010/wordprocessingInk" xmlns:wne="http://schemas.microsoft.com/office/word/2006/wordml" xmlns:wps="http://schemas.microsoft.com/office/word/2010/wordprocessingShape" mc:Ignorable="w14 w15 w16se w16cid w16 w16cex w16sdtdh w16sdtfl w16du wp14">
+  <w:endnote w:type="separator" w:id="-1">
+    <w:p>
+      <w:pPr>
+        <w:spacing w:after="0" w:line="240" w:lineRule="auto"/>
+      </w:pPr>
+      <w:r>
+        <w:separator/>
+      </w:r>
+    </w:p>
+  </w:endnote>
+  <w:endnote w:type="continuationSeparator" w:id="0">
+    <w:p>
+      <w:pPr>
+        <w:spacing w:after="0" w:line="240" w:lineRule="auto"/>
+      </w:pPr>
+      <w:r>
+        <w:continuationSeparator/>
+      </w:r>
+    </w:p>
+  </w:endnote>
+</w:endnotes>
+</file>
+
+<file path=word/footnotes.xml><?xml version="1.0" encoding="utf-8"?>
+<w:footnotes xmlns:wpc="http://schemas.microsoft.com/office/word/2010/wordprocessingCanvas" xmlns:cx="http://schemas.microsoft.com/office/drawing/2014/chartex" xmlns:cx1="http://schemas.microsoft.com/office/drawing/2015/9/8/chartex" xmlns:cx2="http://schemas.microsoft.com/office/drawing/2015/10/21/chartex" xmlns:cx3="http://schemas.microsoft.com/office/drawing/2016/5/9/chartex" xmlns:cx4="http://schemas.microsoft.com/office/drawing/2016/5/10/chartex" xmlns:cx5="http://schemas.microsoft.com/office/drawing/2016/5/11/chartex" xmlns:cx6="http://schemas.microsoft.com/office/drawing/2016/5/12/chartex" xmlns:cx7="http://schemas.microsoft.com/office/drawing/2016/5/13/chartex" xmlns:cx8="http://schemas.microsoft.com/office/drawing/2016/5/14/chartex" xmlns:mc="http://schemas.openxmlformats.org/markup-compatibility/2006" xmlns:aink="http://schemas.microsoft.com/office/drawing/2016/ink" xmlns:am3d="http://schemas.microsoft.com/office/drawing/2017/model3d" xmlns:o="urn:schemas-microsoft-com:office:office" xmlns:oel="http://schemas.microsoft.com/office/2019/extlst" xmlns:r="http://schemas.openxmlformats.org/officeDocument/2006/relationships" xmlns:m="http://schemas.openxmlformats.org/officeDocument/2006/math" xmlns:v="urn:schemas-microsoft-com:vml" xmlns:wp14="http://schemas.microsoft.com/office/word/2010/wordprocessingDrawing" xmlns:wp="http://schemas.openxmlformats.org/drawingml/2006/wordprocessingDrawing" xmlns:w10="urn:schemas-microsoft-com:office:word" xmlns:w="http://schemas.openxmlformats.org/wordprocessingml/2006/main" xmlns:w14="http://schemas.microsoft.com/office/word/2010/wordml" xmlns:w15="http://schemas.microsoft.com/office/word/2012/wordml" xmlns:w16cex="http://schemas.microsoft.com/office/word/2018/wordml/cex" xmlns:w16cid="http://schemas.microsoft.com/office/word/2016/wordml/cid" xmlns:w16="http://schemas.microsoft.com/office/word/2018/wordml" xmlns:w16du="http://schemas.microsoft.com/office/word/2023/wordml/word16du" xmlns:w16sdtdh="http://schemas.microsoft.com/office/word/2020/wordml/sdtdatahash" xmlns:w16sdtfl="http://schemas.microsoft.com/office/word/2024/wordml/sdtformatlock" xmlns:w16se="http://schemas.microsoft.com/office/word/2015/wordml/symex" xmlns:wpg="http://schemas.microsoft.com/office/word/2010/wordprocessingGroup" xmlns:wpi="http://schemas.microsoft.com/office/word/2010/wordprocessingInk" xmlns:wne="http://schemas.microsoft.com/office/word/2006/wordml" xmlns:wps="http://schemas.microsoft.com/office/word/2010/wordprocessingShape" mc:Ignorable="w14 w15 w16se w16cid w16 w16cex w16sdtdh w16sdtfl w16du wp14">
+  <w:footnote w:type="separator" w:id="-1">
+    <w:p>
+      <w:pPr>
+        <w:spacing w:after="0" w:line="240" w:lineRule="auto"/>
+      </w:pPr>
+      <w:r>
+        <w:separator/>
+      </w:r>
+    </w:p>
+  </w:footnote>
+  <w:footnote w:type="continuationSeparator" w:id="0">
+    <w:p>
+      <w:pPr>
+        <w:spacing w:after="0" w:line="240" w:lineRule="auto"/>
+      </w:pPr>
+      <w:r>
+        <w:continuationSeparator/>
+      </w:r>
+    </w:p>
+  </w:footnote>
+</w:footnotes>
+</file>
+
 <file path=word/numbering.xml><?xml version="1.0" encoding="utf-8"?>
 <w:numbering xmlns:wpc="http://schemas.microsoft.com/office/word/2010/wordprocessingCanvas" xmlns:cx="http://schemas.microsoft.com/office/drawing/2014/chartex" xmlns:cx1="http://schemas.microsoft.com/office/drawing/2015/9/8/chartex" xmlns:cx2="http://schemas.microsoft.com/office/drawing/2015/10/21/chartex" xmlns:cx3="http://schemas.microsoft.com/office/drawing/2016/5/9/chartex" xmlns:cx4="http://schemas.microsoft.com/office/drawing/2016/5/10/chartex" xmlns:cx5="http://schemas.microsoft.com/office/drawing/2016/5/11/chartex" xmlns:cx6="http://schemas.microsoft.com/office/drawing/2016/5/12/chartex" xmlns:cx7="http://schemas.microsoft.com/office/drawing/2016/5/13/chartex" xmlns:cx8="http://schemas.microsoft.com/office/drawing/2016/5/14/chartex" xmlns:mc="http://schemas.openxmlformats.org/markup-compatibility/2006" xmlns:aink="http://schemas.microsoft.com/office/drawing/2016/ink" xmlns:am3d="http://schemas.microsoft.com/office/drawing/2017/model3d" xmlns:o="urn:schemas-microsoft-com:office:office" xmlns:oel="http://schemas.microsoft.com/office/2019/extlst" xmlns:r="http://schemas.openxmlformats.org/officeDocument/2006/relationships" xmlns:m="http://schemas.openxmlformats.org/officeDocument/2006/math" xmlns:v="urn:schemas-microsoft-com:vml" xmlns:wp14="http://schemas.microsoft.com/office/word/2010/wordprocessingDrawing" xmlns:wp="http://schemas.openxmlformats.org/drawingml/2006/wordprocessingDrawing" xmlns:w10="urn:schemas-microsoft-com:office:word" xmlns:w="http://schemas.openxmlformats.org/wordprocessingml/2006/main" xmlns:w14="http://schemas.microsoft.com/office/word/2010/wordml" xmlns:w15="http://schemas.microsoft.com/office/word/2012/wordml" xmlns:w16cex="http://schemas.microsoft.com/office/word/2018/wordml/cex" xmlns:w16cid="http://schemas.microsoft.com/office/word/2016/wordml/cid" xmlns:w16="http://schemas.microsoft.com/office/word/2018/wordml" xmlns:w16du="http://schemas.microsoft.com/office/word/2023/wordml/word16du" xmlns:w16sdtdh="http://schemas.microsoft.com/office/word/2020/wordml/sdtdatahash" xmlns:w16sdtfl="http://schemas.microsoft.com/office/word/2024/wordml/sdtformatlock" xmlns:w16se="http://schemas.microsoft.com/office/word/2015/wordml/symex" xmlns:wpg="http://schemas.microsoft.com/office/word/2010/wordprocessingGroup" xmlns:wpi="http://schemas.microsoft.com/office/word/2010/wordprocessingInk" xmlns:wne="http://schemas.microsoft.com/office/word/2006/wordml" xmlns:wps="http://schemas.microsoft.com/office/word/2010/wordprocessingShape" mc:Ignorable="w14 w15 w16se w16cid w16 w16cex w16sdtdh w16sdtfl w16du wp14">
   <w:abstractNum w:abstractNumId="0" w15:restartNumberingAfterBreak="0">
@@ -515,6 +1121,119 @@
     </w:lvl>
   </w:abstractNum>
   <w:abstractNum w:abstractNumId="2" w15:restartNumberingAfterBreak="0">
+    <w:nsid w:val="5E86024B"/>
+    <w:multiLevelType w:val="hybridMultilevel"/>
+    <w:tmpl w:val="274E3980"/>
+    <w:lvl w:ilvl="0" w:tplc="340A0001">
+      <w:start w:val="1"/>
+      <w:numFmt w:val="bullet"/>
+      <w:lvlText w:val=""/>
+      <w:lvlJc w:val="left"/>
+      <w:pPr>
+        <w:ind w:left="720" w:hanging="360"/>
+      </w:pPr>
+      <w:rPr>
+        <w:rFonts w:ascii="Symbol" w:hAnsi="Symbol" w:hint="default"/>
+      </w:rPr>
+    </w:lvl>
+    <w:lvl w:ilvl="1" w:tplc="340A0003" w:tentative="1">
+      <w:start w:val="1"/>
+      <w:numFmt w:val="bullet"/>
+      <w:lvlText w:val="o"/>
+      <w:lvlJc w:val="left"/>
+      <w:pPr>
+        <w:ind w:left="1440" w:hanging="360"/>
+      </w:pPr>
+      <w:rPr>
+        <w:rFonts w:ascii="Courier New" w:hAnsi="Courier New" w:cs="Courier New" w:hint="default"/>
+      </w:rPr>
+    </w:lvl>
+    <w:lvl w:ilvl="2" w:tplc="340A0005" w:tentative="1">
+      <w:start w:val="1"/>
+      <w:numFmt w:val="bullet"/>
+      <w:lvlText w:val=""/>
+      <w:lvlJc w:val="left"/>
+      <w:pPr>
+        <w:ind w:left="2160" w:hanging="360"/>
+      </w:pPr>
+      <w:rPr>
+        <w:rFonts w:ascii="Wingdings" w:hAnsi="Wingdings" w:hint="default"/>
+      </w:rPr>
+    </w:lvl>
+    <w:lvl w:ilvl="3" w:tplc="340A0001" w:tentative="1">
+      <w:start w:val="1"/>
+      <w:numFmt w:val="bullet"/>
+      <w:lvlText w:val=""/>
+      <w:lvlJc w:val="left"/>
+      <w:pPr>
+        <w:ind w:left="2880" w:hanging="360"/>
+      </w:pPr>
+      <w:rPr>
+        <w:rFonts w:ascii="Symbol" w:hAnsi="Symbol" w:hint="default"/>
+      </w:rPr>
+    </w:lvl>
+    <w:lvl w:ilvl="4" w:tplc="340A0003" w:tentative="1">
+      <w:start w:val="1"/>
+      <w:numFmt w:val="bullet"/>
+      <w:lvlText w:val="o"/>
+      <w:lvlJc w:val="left"/>
+      <w:pPr>
+        <w:ind w:left="3600" w:hanging="360"/>
+      </w:pPr>
+      <w:rPr>
+        <w:rFonts w:ascii="Courier New" w:hAnsi="Courier New" w:cs="Courier New" w:hint="default"/>
+      </w:rPr>
+    </w:lvl>
+    <w:lvl w:ilvl="5" w:tplc="340A0005" w:tentative="1">
+      <w:start w:val="1"/>
+      <w:numFmt w:val="bullet"/>
+      <w:lvlText w:val=""/>
+      <w:lvlJc w:val="left"/>
+      <w:pPr>
+        <w:ind w:left="4320" w:hanging="360"/>
+      </w:pPr>
+      <w:rPr>
+        <w:rFonts w:ascii="Wingdings" w:hAnsi="Wingdings" w:hint="default"/>
+      </w:rPr>
+    </w:lvl>
+    <w:lvl w:ilvl="6" w:tplc="340A0001" w:tentative="1">
+      <w:start w:val="1"/>
+      <w:numFmt w:val="bullet"/>
+      <w:lvlText w:val=""/>
+      <w:lvlJc w:val="left"/>
+      <w:pPr>
+        <w:ind w:left="5040" w:hanging="360"/>
+      </w:pPr>
+      <w:rPr>
+        <w:rFonts w:ascii="Symbol" w:hAnsi="Symbol" w:hint="default"/>
+      </w:rPr>
+    </w:lvl>
+    <w:lvl w:ilvl="7" w:tplc="340A0003" w:tentative="1">
+      <w:start w:val="1"/>
+      <w:numFmt w:val="bullet"/>
+      <w:lvlText w:val="o"/>
+      <w:lvlJc w:val="left"/>
+      <w:pPr>
+        <w:ind w:left="5760" w:hanging="360"/>
+      </w:pPr>
+      <w:rPr>
+        <w:rFonts w:ascii="Courier New" w:hAnsi="Courier New" w:cs="Courier New" w:hint="default"/>
+      </w:rPr>
+    </w:lvl>
+    <w:lvl w:ilvl="8" w:tplc="340A0005" w:tentative="1">
+      <w:start w:val="1"/>
+      <w:numFmt w:val="bullet"/>
+      <w:lvlText w:val=""/>
+      <w:lvlJc w:val="left"/>
+      <w:pPr>
+        <w:ind w:left="6480" w:hanging="360"/>
+      </w:pPr>
+      <w:rPr>
+        <w:rFonts w:ascii="Wingdings" w:hAnsi="Wingdings" w:hint="default"/>
+      </w:rPr>
+    </w:lvl>
+  </w:abstractNum>
+  <w:abstractNum w:abstractNumId="3" w15:restartNumberingAfterBreak="0">
     <w:nsid w:val="6EB565CE"/>
     <w:multiLevelType w:val="hybridMultilevel"/>
     <w:tmpl w:val="7B143304"/>
@@ -530,6 +1249,119 @@
       </w:rPr>
     </w:lvl>
     <w:lvl w:ilvl="1" w:tplc="340A0003" w:tentative="1">
+      <w:start w:val="1"/>
+      <w:numFmt w:val="bullet"/>
+      <w:lvlText w:val="o"/>
+      <w:lvlJc w:val="left"/>
+      <w:pPr>
+        <w:ind w:left="1440" w:hanging="360"/>
+      </w:pPr>
+      <w:rPr>
+        <w:rFonts w:ascii="Courier New" w:hAnsi="Courier New" w:cs="Courier New" w:hint="default"/>
+      </w:rPr>
+    </w:lvl>
+    <w:lvl w:ilvl="2" w:tplc="340A0005" w:tentative="1">
+      <w:start w:val="1"/>
+      <w:numFmt w:val="bullet"/>
+      <w:lvlText w:val=""/>
+      <w:lvlJc w:val="left"/>
+      <w:pPr>
+        <w:ind w:left="2160" w:hanging="360"/>
+      </w:pPr>
+      <w:rPr>
+        <w:rFonts w:ascii="Wingdings" w:hAnsi="Wingdings" w:hint="default"/>
+      </w:rPr>
+    </w:lvl>
+    <w:lvl w:ilvl="3" w:tplc="340A0001" w:tentative="1">
+      <w:start w:val="1"/>
+      <w:numFmt w:val="bullet"/>
+      <w:lvlText w:val=""/>
+      <w:lvlJc w:val="left"/>
+      <w:pPr>
+        <w:ind w:left="2880" w:hanging="360"/>
+      </w:pPr>
+      <w:rPr>
+        <w:rFonts w:ascii="Symbol" w:hAnsi="Symbol" w:hint="default"/>
+      </w:rPr>
+    </w:lvl>
+    <w:lvl w:ilvl="4" w:tplc="340A0003" w:tentative="1">
+      <w:start w:val="1"/>
+      <w:numFmt w:val="bullet"/>
+      <w:lvlText w:val="o"/>
+      <w:lvlJc w:val="left"/>
+      <w:pPr>
+        <w:ind w:left="3600" w:hanging="360"/>
+      </w:pPr>
+      <w:rPr>
+        <w:rFonts w:ascii="Courier New" w:hAnsi="Courier New" w:cs="Courier New" w:hint="default"/>
+      </w:rPr>
+    </w:lvl>
+    <w:lvl w:ilvl="5" w:tplc="340A0005" w:tentative="1">
+      <w:start w:val="1"/>
+      <w:numFmt w:val="bullet"/>
+      <w:lvlText w:val=""/>
+      <w:lvlJc w:val="left"/>
+      <w:pPr>
+        <w:ind w:left="4320" w:hanging="360"/>
+      </w:pPr>
+      <w:rPr>
+        <w:rFonts w:ascii="Wingdings" w:hAnsi="Wingdings" w:hint="default"/>
+      </w:rPr>
+    </w:lvl>
+    <w:lvl w:ilvl="6" w:tplc="340A0001" w:tentative="1">
+      <w:start w:val="1"/>
+      <w:numFmt w:val="bullet"/>
+      <w:lvlText w:val=""/>
+      <w:lvlJc w:val="left"/>
+      <w:pPr>
+        <w:ind w:left="5040" w:hanging="360"/>
+      </w:pPr>
+      <w:rPr>
+        <w:rFonts w:ascii="Symbol" w:hAnsi="Symbol" w:hint="default"/>
+      </w:rPr>
+    </w:lvl>
+    <w:lvl w:ilvl="7" w:tplc="340A0003" w:tentative="1">
+      <w:start w:val="1"/>
+      <w:numFmt w:val="bullet"/>
+      <w:lvlText w:val="o"/>
+      <w:lvlJc w:val="left"/>
+      <w:pPr>
+        <w:ind w:left="5760" w:hanging="360"/>
+      </w:pPr>
+      <w:rPr>
+        <w:rFonts w:ascii="Courier New" w:hAnsi="Courier New" w:cs="Courier New" w:hint="default"/>
+      </w:rPr>
+    </w:lvl>
+    <w:lvl w:ilvl="8" w:tplc="340A0005" w:tentative="1">
+      <w:start w:val="1"/>
+      <w:numFmt w:val="bullet"/>
+      <w:lvlText w:val=""/>
+      <w:lvlJc w:val="left"/>
+      <w:pPr>
+        <w:ind w:left="6480" w:hanging="360"/>
+      </w:pPr>
+      <w:rPr>
+        <w:rFonts w:ascii="Wingdings" w:hAnsi="Wingdings" w:hint="default"/>
+      </w:rPr>
+    </w:lvl>
+  </w:abstractNum>
+  <w:abstractNum w:abstractNumId="4" w15:restartNumberingAfterBreak="0">
+    <w:nsid w:val="7F0549F2"/>
+    <w:multiLevelType w:val="hybridMultilevel"/>
+    <w:tmpl w:val="ED384666"/>
+    <w:lvl w:ilvl="0" w:tplc="340A0001">
+      <w:start w:val="1"/>
+      <w:numFmt w:val="bullet"/>
+      <w:lvlText w:val=""/>
+      <w:lvlJc w:val="left"/>
+      <w:pPr>
+        <w:ind w:left="720" w:hanging="360"/>
+      </w:pPr>
+      <w:rPr>
+        <w:rFonts w:ascii="Symbol" w:hAnsi="Symbol" w:hint="default"/>
+      </w:rPr>
+    </w:lvl>
+    <w:lvl w:ilvl="1" w:tplc="340A0003">
       <w:start w:val="1"/>
       <w:numFmt w:val="bullet"/>
       <w:lvlText w:val="o"/>
@@ -630,10 +1462,16 @@
     <w:abstractNumId w:val="1"/>
   </w:num>
   <w:num w:numId="2" w16cid:durableId="1856574067">
-    <w:abstractNumId w:val="2"/>
+    <w:abstractNumId w:val="3"/>
   </w:num>
   <w:num w:numId="3" w16cid:durableId="2062316334">
     <w:abstractNumId w:val="0"/>
+  </w:num>
+  <w:num w:numId="4" w16cid:durableId="369575188">
+    <w:abstractNumId w:val="2"/>
+  </w:num>
+  <w:num w:numId="5" w16cid:durableId="390350465">
+    <w:abstractNumId w:val="4"/>
   </w:num>
 </w:numbering>
 </file>
@@ -1554,6 +2392,50 @@
       <w:spacing w:val="5"/>
     </w:rPr>
   </w:style>
+  <w:style w:type="paragraph" w:styleId="Encabezado">
+    <w:name w:val="header"/>
+    <w:basedOn w:val="Normal"/>
+    <w:link w:val="EncabezadoCar"/>
+    <w:uiPriority w:val="99"/>
+    <w:unhideWhenUsed/>
+    <w:rsid w:val="00346B09"/>
+    <w:pPr>
+      <w:tabs>
+        <w:tab w:val="center" w:pos="4419"/>
+        <w:tab w:val="right" w:pos="8838"/>
+      </w:tabs>
+      <w:spacing w:after="0" w:line="240" w:lineRule="auto"/>
+    </w:pPr>
+  </w:style>
+  <w:style w:type="character" w:customStyle="1" w:styleId="EncabezadoCar">
+    <w:name w:val="Encabezado Car"/>
+    <w:basedOn w:val="Fuentedeprrafopredeter"/>
+    <w:link w:val="Encabezado"/>
+    <w:uiPriority w:val="99"/>
+    <w:rsid w:val="00346B09"/>
+  </w:style>
+  <w:style w:type="paragraph" w:styleId="Piedepgina">
+    <w:name w:val="footer"/>
+    <w:basedOn w:val="Normal"/>
+    <w:link w:val="PiedepginaCar"/>
+    <w:uiPriority w:val="99"/>
+    <w:unhideWhenUsed/>
+    <w:rsid w:val="00346B09"/>
+    <w:pPr>
+      <w:tabs>
+        <w:tab w:val="center" w:pos="4419"/>
+        <w:tab w:val="right" w:pos="8838"/>
+      </w:tabs>
+      <w:spacing w:after="0" w:line="240" w:lineRule="auto"/>
+    </w:pPr>
+  </w:style>
+  <w:style w:type="character" w:customStyle="1" w:styleId="PiedepginaCar">
+    <w:name w:val="Pie de página Car"/>
+    <w:basedOn w:val="Fuentedeprrafopredeter"/>
+    <w:link w:val="Piedepgina"/>
+    <w:uiPriority w:val="99"/>
+    <w:rsid w:val="00346B09"/>
+  </w:style>
 </w:styles>
 </file>
 

</xml_diff>